<commit_message>
Arizona Center for Hand to Shoulder Surgery: rebuild letter on latest template and AJAC layout
Rebuilt from the updated HOURLY template (unbolded opening clause, fixed
work-product wording) using the Oct 2026 conventions: client-name-only cover,
Initial priorities list, no em-dashes in Section 1, ONYX-does-not-file-taxes
language, and billed-as-incurred wording in place of hour tables.

Co-Authored-By: Claude Opus 5.5 <noreply@anthropic.com>
Claude-Session: https://claude.ai/code/session_01KQiKzmv3wJWX8AFkC8re3n
</commit_message>
<xml_diff>
--- a/Onyx_Engagement_Letter_AZHandCenter_HOURLY.docx
+++ b/Onyx_Engagement_Letter_AZHandCenter_HOURLY.docx
@@ -260,48 +260,12 @@
         <w:pStyle w:val="CLAProNormalNoSpaceAfter"/>
         <w:ind w:left="4140" w:hanging="4590"/>
       </w:pPr>
-      <w:r>
-        <w:rPr>
-          <w:i/>
-        </w:rPr>
-        <w:t xml:space="preserve">Dependable finance leadership for a growing physician practice — with the continuity and senior point of contact your physicians need.</w:t>
-      </w:r>
     </w:p>
     <w:p>
       <w:pPr>
         <w:pStyle w:val="CLAProNormalNoSpaceAfter"/>
         <w:ind w:left="4140" w:hanging="4590"/>
       </w:pPr>
-      <w:r>
-        <w:t xml:space="preserve">·   Consistent CFO-level relationship lead</w:t>
-      </w:r>
-    </w:p>
-    <w:p>
-      <w:pPr>
-        <w:pStyle w:val="CLAProNormalNoSpaceAfter"/>
-        <w:ind w:left="4140" w:hanging="4590"/>
-      </w:pPr>
-      <w:r>
-        <w:t xml:space="preserve">·   Controller leadership of the monthly close</w:t>
-      </w:r>
-    </w:p>
-    <w:p>
-      <w:pPr>
-        <w:pStyle w:val="CLAProNormalNoSpaceAfter"/>
-        <w:ind w:left="4140" w:hanging="4590"/>
-      </w:pPr>
-      <w:r>
-        <w:t xml:space="preserve">·   Physician compensation &amp; revenue-cycle reporting</w:t>
-      </w:r>
-    </w:p>
-    <w:p>
-      <w:pPr>
-        <w:pStyle w:val="CLAProNormalNoSpaceAfter"/>
-        <w:ind w:left="4140" w:hanging="4590"/>
-      </w:pPr>
-      <w:r>
-        <w:t xml:space="preserve">·   Knowledge transfer &amp; a 90-day onboarding plan</w:t>
-      </w:r>
     </w:p>
     <w:p>
       <w:pPr>
@@ -482,7 +446,13 @@
         <w:pStyle w:val="CLALTRAddressorSignature"/>
       </w:pPr>
       <w:r>
-        <w:t xml:space="preserve">Attn: Mark Williamson, [Title]</w:t>
+        <w:t xml:space="preserve">Attn: Mark Williamson, </w:t>
+      </w:r>
+      <w:r>
+        <w:rPr>
+          <w:highlight w:val="yellow"/>
+        </w:rPr>
+        <w:t xml:space="preserve">[Title]</w:t>
       </w:r>
     </w:p>
     <w:p>
@@ -769,79 +739,79 @@
       </w:r>
       <w:r>
         <w:rPr>
-          <w:b/>
+          <w:b w:val="0"/>
         </w:rPr>
         <w:t xml:space="preserve">will apply to the </w:t>
       </w:r>
       <w:r>
         <w:rPr>
-          <w:b/>
+          <w:b w:val="0"/>
         </w:rPr>
         <w:t>I</w:t>
       </w:r>
       <w:r>
         <w:rPr>
-          <w:b/>
+          <w:b w:val="0"/>
         </w:rPr>
         <w:t>nitial</w:t>
       </w:r>
       <w:r>
         <w:rPr>
-          <w:b/>
+          <w:b w:val="0"/>
         </w:rPr>
         <w:t xml:space="preserve"> Period</w:t>
       </w:r>
       <w:r>
         <w:rPr>
-          <w:b/>
+          <w:b w:val="0"/>
         </w:rPr>
         <w:t>,</w:t>
       </w:r>
       <w:r>
         <w:rPr>
-          <w:b/>
+          <w:b w:val="0"/>
         </w:rPr>
         <w:t xml:space="preserve"> and all subsequent </w:t>
       </w:r>
       <w:r>
         <w:rPr>
-          <w:b/>
+          <w:b w:val="0"/>
         </w:rPr>
         <w:t>periods</w:t>
       </w:r>
       <w:r>
         <w:rPr>
-          <w:b/>
+          <w:b w:val="0"/>
         </w:rPr>
         <w:t xml:space="preserve">, unless the </w:t>
       </w:r>
       <w:r>
         <w:rPr>
-          <w:b/>
+          <w:b w:val="0"/>
         </w:rPr>
         <w:t>terms of our engagement are</w:t>
       </w:r>
       <w:r>
         <w:rPr>
-          <w:b/>
+          <w:b w:val="0"/>
         </w:rPr>
         <w:t xml:space="preserve"> changed in a </w:t>
       </w:r>
       <w:r>
         <w:rPr>
-          <w:b/>
+          <w:b w:val="0"/>
         </w:rPr>
         <w:t xml:space="preserve">written </w:t>
       </w:r>
       <w:r>
         <w:rPr>
-          <w:b/>
+          <w:b w:val="0"/>
         </w:rPr>
         <w:t xml:space="preserve">communication </w:t>
       </w:r>
       <w:r>
         <w:rPr>
-          <w:b/>
+          <w:b w:val="0"/>
         </w:rPr>
         <w:t>including by email, agreed to by both ONYX and the Client</w:t>
       </w:r>
@@ -886,28 +856,38 @@
         <w:jc w:val="both"/>
       </w:pPr>
       <w:r>
-        <w:t xml:space="preserve">ONYX steps in as the practice’s finance leadership team — a consistent, senior point of contact backed by a controller and, where it helps, staff-level support — so the physicians have accurate, timely numbers and a trusted finance contact through Mark Williamson’s transition and beyond. Every deliverable is prepared by one team member and reviewed by another, mirroring professional-services quality control, and the Client sees transparent time detail and regular reporting on completed work. The services below are illustrative of what ONYX provides and are not a fixed or exhaustive list; we tailor the mix to the Client’s needs and adjust it as those needs change.</w:t>
-      </w:r>
-    </w:p>
-    <w:p>
-      <w:pPr>
-        <w:pStyle w:val="CLALTRNormal"/>
-        <w:jc w:val="both"/>
-      </w:pPr>
+        <w:t xml:space="preserve">ONYX steps in as the practice’s finance leadership team: a consistent, senior point of contact backed by a controller and, where it helps, staff-level support. We give the physicians accurate, timely numbers and a trusted finance contact through Mark Williamson’s transition and beyond, follow a perform-and-review approach so the person doing the work is never the one reviewing it, and scale our involvement up or down as the finance function is rebuilt. The services below are illustrative of what ONYX provides and are not a fixed or exhaustive list; we tailor the mix to the Client’s needs and adjust it as those needs change. This engagement covers the Client and, as the Client directs, its related entities, </w:t>
+      </w:r>
       <w:r>
         <w:rPr>
           <w:highlight w:val="yellow"/>
         </w:rPr>
-        <w:t xml:space="preserve">Our services cover the Client and, as the Client directs, its related entities — [Surgery center legal name] and Arizona Pharmacy Consultants, [entity type] — each maintained in QuickBooks Online.</w:t>
-      </w:r>
-    </w:p>
-    <w:p>
-      <w:pPr>
-        <w:pStyle w:val="CLALTRHeading2"/>
-        <w:jc w:val="both"/>
-      </w:pPr>
-      <w:r>
-        <w:t xml:space="preserve">Scope of services:</w:t>
+        <w:t xml:space="preserve">[Surgery center legal name]</w:t>
+      </w:r>
+      <w:r>
+        <w:t xml:space="preserve"> and Arizona Pharmacy Consultants, </w:t>
+      </w:r>
+      <w:r>
+        <w:rPr>
+          <w:highlight w:val="yellow"/>
+        </w:rPr>
+        <w:t xml:space="preserve">[entity type]</w:t>
+      </w:r>
+      <w:r>
+        <w:t xml:space="preserve">, each maintained in QuickBooks Online.</w:t>
+      </w:r>
+    </w:p>
+    <w:p>
+      <w:pPr>
+        <w:pStyle w:val="CLALTRNormal"/>
+        <w:jc w:val="both"/>
+      </w:pPr>
+      <w:r>
+        <w:rPr>
+          <w:b/>
+          <w:bCs/>
+        </w:rPr>
+        <w:t xml:space="preserve">Initial priorities:</w:t>
       </w:r>
     </w:p>
     <w:p>
@@ -915,27 +895,12 @@
         <w:pStyle w:val="CLALTRNormal"/>
         <w:numPr>
           <w:ilvl w:val="0"/>
-          <w:numId w:val="8"/>
+          <w:numId w:val="9"/>
         </w:numPr>
         <w:jc w:val="both"/>
       </w:pPr>
       <w:r>
-        <w:rPr>
-          <w:highlight w:val="yellow"/>
-        </w:rPr>
-        <w:t xml:space="preserve">Onboarding and knowledge transfer</w:t>
-      </w:r>
-    </w:p>
-    <w:p>
-      <w:pPr>
-        <w:pStyle w:val="CLALTRNormal"/>
-        <w:jc w:val="both"/>
-      </w:pPr>
-      <w:r>
-        <w:rPr>
-          <w:highlight w:val="yellow"/>
-        </w:rPr>
-        <w:t xml:space="preserve">During the first 90 days, ONYX works alongside Mark and the internal accounting team to capture what they know and stabilize the finance function:</w:t>
+        <w:t xml:space="preserve">Provide a consistent finance contact and immediate continuity as Mark Williamson reduces his hours, with Mark supporting onboarding and knowledge transfer.</w:t>
       </w:r>
     </w:p>
     <w:p>
@@ -943,15 +908,12 @@
         <w:pStyle w:val="CLALTRNormal"/>
         <w:numPr>
           <w:ilvl w:val="0"/>
-          <w:numId w:val="10"/>
+          <w:numId w:val="9"/>
         </w:numPr>
         <w:jc w:val="both"/>
       </w:pPr>
       <w:r>
-        <w:rPr>
-          <w:highlight w:val="yellow"/>
-        </w:rPr>
-        <w:t xml:space="preserve">Deliver a 30/60/90-day onboarding plan centered on knowledge transfer, close stabilization, physician compensation, revenue-cycle reporting, and systems integration</w:t>
+        <w:t xml:space="preserve">Deliver a 30/60/90-day onboarding plan centered on knowledge transfer, close stabilization, physician compensation, revenue-cycle reporting, and systems integration.</w:t>
       </w:r>
     </w:p>
     <w:p>
@@ -959,15 +921,12 @@
         <w:pStyle w:val="CLALTRNormal"/>
         <w:numPr>
           <w:ilvl w:val="0"/>
-          <w:numId w:val="10"/>
+          <w:numId w:val="9"/>
         </w:numPr>
         <w:jc w:val="both"/>
       </w:pPr>
       <w:r>
-        <w:rPr>
-          <w:highlight w:val="yellow"/>
-        </w:rPr>
-        <w:t xml:space="preserve">Document the monthly close, physician compensation and bonus calculations, revenue-cycle reporting, payroll mappings, and borrowing-base reporting, so critical knowledge no longer rests with one person</w:t>
+        <w:t xml:space="preserve">Document the monthly close, physician compensation and bonus calculations, revenue-cycle reporting, payroll mappings, and borrowing-base reporting, so critical knowledge no longer rests with one person.</w:t>
       </w:r>
     </w:p>
     <w:p>
@@ -975,15 +934,12 @@
         <w:pStyle w:val="CLALTRNormal"/>
         <w:numPr>
           <w:ilvl w:val="0"/>
-          <w:numId w:val="10"/>
+          <w:numId w:val="9"/>
         </w:numPr>
         <w:jc w:val="both"/>
       </w:pPr>
       <w:r>
-        <w:rPr>
-          <w:highlight w:val="yellow"/>
-        </w:rPr>
-        <w:t xml:space="preserve">Review the QuickBooks Online class structure, workflows, and controls across all three entities</w:t>
+        <w:t xml:space="preserve">Review the QuickBooks Online class structure, workflows, and controls across all three entities.</w:t>
       </w:r>
     </w:p>
     <w:p>
@@ -991,15 +947,12 @@
         <w:pStyle w:val="CLALTRNormal"/>
         <w:numPr>
           <w:ilvl w:val="0"/>
-          <w:numId w:val="10"/>
+          <w:numId w:val="9"/>
         </w:numPr>
         <w:jc w:val="both"/>
       </w:pPr>
       <w:r>
-        <w:rPr>
-          <w:highlight w:val="yellow"/>
-        </w:rPr>
-        <w:t xml:space="preserve">Provide weekly onboarding updates, an open-items tracker, and a summary of completed work</w:t>
+        <w:t xml:space="preserve">Provide weekly onboarding updates, an open-items tracker, and a summary of completed work.</w:t>
       </w:r>
     </w:p>
     <w:p>
@@ -1007,15 +960,12 @@
         <w:pStyle w:val="CLALTRNormal"/>
         <w:numPr>
           <w:ilvl w:val="0"/>
-          <w:numId w:val="10"/>
+          <w:numId w:val="9"/>
         </w:numPr>
         <w:jc w:val="both"/>
       </w:pPr>
       <w:r>
-        <w:rPr>
-          <w:highlight w:val="yellow"/>
-        </w:rPr>
-        <w:t xml:space="preserve">Work onsite at the Client’s offices [onsite cadence] and remotely otherwise</w:t>
+        <w:t xml:space="preserve">Build an initial automation roadmap for accounts payable, payroll journals, eClinicalWorks-to-general-ledger activity, close checklists, and KPI dashboards, with documented review controls so every automated or AI-assisted output is verified by an experienced team member before it is relied on.</w:t>
       </w:r>
     </w:p>
     <w:p>
@@ -1023,27 +973,52 @@
         <w:pStyle w:val="CLALTRNormal"/>
         <w:numPr>
           <w:ilvl w:val="0"/>
-          <w:numId w:val="8"/>
+          <w:numId w:val="9"/>
         </w:numPr>
         <w:jc w:val="both"/>
       </w:pPr>
       <w:r>
+        <w:t xml:space="preserve">Work onsite at the Client’s offices </w:t>
+      </w:r>
+      <w:r>
         <w:rPr>
           <w:highlight w:val="yellow"/>
         </w:rPr>
-        <w:t xml:space="preserve">CFO-level leadership</w:t>
-      </w:r>
-    </w:p>
-    <w:p>
-      <w:pPr>
-        <w:pStyle w:val="CLALTRNormal"/>
-        <w:jc w:val="both"/>
-      </w:pPr>
-      <w:r>
-        <w:rPr>
-          <w:highlight w:val="yellow"/>
-        </w:rPr>
-        <w:t xml:space="preserve">A consistent, senior relationship lead who becomes the physicians’ trusted finance contact, providing the guidance and forward-looking planning of a CFO without the full-time cost:</w:t>
+        <w:t xml:space="preserve">[onsite cadence]</w:t>
+      </w:r>
+      <w:r>
+        <w:t xml:space="preserve"> and remotely otherwise.</w:t>
+      </w:r>
+    </w:p>
+    <w:p>
+      <w:pPr>
+        <w:pStyle w:val="CLALTRHeading2"/>
+        <w:jc w:val="both"/>
+      </w:pPr>
+      <w:r>
+        <w:t xml:space="preserve">Ongoing normal accounting services:</w:t>
+      </w:r>
+    </w:p>
+    <w:p>
+      <w:pPr>
+        <w:pStyle w:val="CLALTRNormal"/>
+        <w:jc w:val="both"/>
+      </w:pPr>
+      <w:r>
+        <w:rPr>
+          <w:b/>
+          <w:bCs/>
+        </w:rPr>
+        <w:t xml:space="preserve">Controller-level oversight and reporting</w:t>
+      </w:r>
+    </w:p>
+    <w:p>
+      <w:pPr>
+        <w:pStyle w:val="CLALTRNormal"/>
+        <w:jc w:val="both"/>
+      </w:pPr>
+      <w:r>
+        <w:t xml:space="preserve">Hands-on leadership of the monthly close and the accounting team, so management always has accurate, timely numbers to act on:</w:t>
       </w:r>
     </w:p>
     <w:p>
@@ -1051,15 +1026,12 @@
         <w:pStyle w:val="CLALTRNormal"/>
         <w:numPr>
           <w:ilvl w:val="0"/>
-          <w:numId w:val="10"/>
+          <w:numId w:val="9"/>
         </w:numPr>
         <w:jc w:val="both"/>
       </w:pPr>
       <w:r>
-        <w:rPr>
-          <w:highlight w:val="yellow"/>
-        </w:rPr>
-        <w:t xml:space="preserve">Serve as the relationship lead — [Name] — and the primary finance contact for the physicians, shareholders, and executive board</w:t>
+        <w:t xml:space="preserve">Lead the monthly close and review the reconciliations and journal entries prepared by the internal team, adding an independent layer of review.</w:t>
       </w:r>
     </w:p>
     <w:p>
@@ -1067,15 +1039,12 @@
         <w:pStyle w:val="CLALTRNormal"/>
         <w:numPr>
           <w:ilvl w:val="0"/>
-          <w:numId w:val="10"/>
+          <w:numId w:val="9"/>
         </w:numPr>
         <w:jc w:val="both"/>
       </w:pPr>
       <w:r>
-        <w:rPr>
-          <w:highlight w:val="yellow"/>
-        </w:rPr>
-        <w:t xml:space="preserve">Present financial results and insight to the executive board as needed and at the annual December shareholder meeting</w:t>
+        <w:t xml:space="preserve">Turn each entity’s monthly, quarterly, and annual results into clear management reporting and analysis for the physicians and shareholders.</w:t>
       </w:r>
     </w:p>
     <w:p>
@@ -1083,15 +1052,12 @@
         <w:pStyle w:val="CLALTRNormal"/>
         <w:numPr>
           <w:ilvl w:val="0"/>
-          <w:numId w:val="10"/>
+          <w:numId w:val="9"/>
         </w:numPr>
         <w:jc w:val="both"/>
       </w:pPr>
       <w:r>
-        <w:rPr>
-          <w:highlight w:val="yellow"/>
-        </w:rPr>
-        <w:t xml:space="preserve">Lead budgeting, forecasting, and variance analysis to support strategic decisions across the clinics, therapy suites, and surgery center</w:t>
+        <w:t xml:space="preserve">Support the physician compensation process, including class-based allocations and the mid-month physician bonus calculations.</w:t>
       </w:r>
     </w:p>
     <w:p>
@@ -1099,15 +1065,12 @@
         <w:pStyle w:val="CLALTRNormal"/>
         <w:numPr>
           <w:ilvl w:val="0"/>
-          <w:numId w:val="10"/>
+          <w:numId w:val="9"/>
         </w:numPr>
         <w:jc w:val="both"/>
       </w:pPr>
       <w:r>
-        <w:rPr>
-          <w:highlight w:val="yellow"/>
-        </w:rPr>
-        <w:t xml:space="preserve">Oversee lender reporting for the Client’s lines of credit, including borrowing-base reporting and covenant tracking, and support bank communications</w:t>
+        <w:t xml:space="preserve">Reconcile revenue-cycle activity to the general ledger and prepare monthly revenue-cycle analysis (gross charges, collection rates, denials, and payer trends), working with the revenue-cycle team to address issues as they arise.</w:t>
       </w:r>
     </w:p>
     <w:p>
@@ -1115,15 +1078,12 @@
         <w:pStyle w:val="CLALTRNormal"/>
         <w:numPr>
           <w:ilvl w:val="0"/>
-          <w:numId w:val="10"/>
+          <w:numId w:val="9"/>
         </w:numPr>
         <w:jc w:val="both"/>
       </w:pPr>
       <w:r>
-        <w:rPr>
-          <w:highlight w:val="yellow"/>
-        </w:rPr>
-        <w:t xml:space="preserve">Coordinate with the Client’s tax, legal, insurance, benefits, and retirement-plan advisors on finance matters</w:t>
+        <w:t xml:space="preserve">Guide and support the internal accounting team across accounts payable, accounts receivable, and the general ledger, and serve as the day-to-day point of contact for accounting questions.</w:t>
       </w:r>
     </w:p>
     <w:p>
@@ -1131,15 +1091,12 @@
         <w:pStyle w:val="CLALTRNormal"/>
         <w:numPr>
           <w:ilvl w:val="0"/>
-          <w:numId w:val="10"/>
+          <w:numId w:val="9"/>
         </w:numPr>
         <w:jc w:val="both"/>
       </w:pPr>
       <w:r>
-        <w:rPr>
-          <w:highlight w:val="yellow"/>
-        </w:rPr>
-        <w:t xml:space="preserve">Advise on financial reporting structure, management reporting, and accounting policy</w:t>
+        <w:t xml:space="preserve">Reduce manual work in the eClinicalWorks-to-QuickBooks, payroll-to-general-ledger, and allocation processes, and support the evaluation of a payroll-provider transition.</w:t>
       </w:r>
     </w:p>
     <w:p>
@@ -1147,27 +1104,12 @@
         <w:pStyle w:val="CLALTRNormal"/>
         <w:numPr>
           <w:ilvl w:val="0"/>
-          <w:numId w:val="8"/>
+          <w:numId w:val="9"/>
         </w:numPr>
         <w:jc w:val="both"/>
       </w:pPr>
       <w:r>
-        <w:rPr>
-          <w:highlight w:val="yellow"/>
-        </w:rPr>
-        <w:t xml:space="preserve">Controller-level oversight and reporting</w:t>
-      </w:r>
-    </w:p>
-    <w:p>
-      <w:pPr>
-        <w:pStyle w:val="CLALTRNormal"/>
-        <w:jc w:val="both"/>
-      </w:pPr>
-      <w:r>
-        <w:rPr>
-          <w:highlight w:val="yellow"/>
-        </w:rPr>
-        <w:t xml:space="preserve">Hands-on leadership of the monthly close and the accounting team, so management always has accurate, timely numbers to act on:</w:t>
+        <w:t xml:space="preserve">Recommend improvements to internal controls, and document accounting processes and procedures.</w:t>
       </w:r>
     </w:p>
     <w:p>
@@ -1175,15 +1117,34 @@
         <w:pStyle w:val="CLALTRNormal"/>
         <w:numPr>
           <w:ilvl w:val="0"/>
-          <w:numId w:val="10"/>
+          <w:numId w:val="9"/>
         </w:numPr>
         <w:jc w:val="both"/>
       </w:pPr>
       <w:r>
-        <w:rPr>
-          <w:highlight w:val="yellow"/>
-        </w:rPr>
-        <w:t xml:space="preserve">Lead the monthly close and review the reconciliations and journal entries prepared by the internal team and ONYX staff, adding an independent layer of review</w:t>
+        <w:t xml:space="preserve">Gather and organize everything the Client’s tax preparer and auditors need, and support audits and regulatory reviews by providing information. ONYX does not prepare or file tax returns; the Client’s tax preparer handles all tax filings.</w:t>
+      </w:r>
+    </w:p>
+    <w:p>
+      <w:pPr>
+        <w:pStyle w:val="CLALTRNormal"/>
+        <w:jc w:val="both"/>
+      </w:pPr>
+      <w:r>
+        <w:rPr>
+          <w:b/>
+          <w:bCs/>
+        </w:rPr>
+        <w:t xml:space="preserve">CFO-level strategic support</w:t>
+      </w:r>
+    </w:p>
+    <w:p>
+      <w:pPr>
+        <w:pStyle w:val="CLALTRNormal"/>
+        <w:jc w:val="both"/>
+      </w:pPr>
+      <w:r>
+        <w:t xml:space="preserve">A consistent, senior relationship lead who becomes the physicians’ trusted finance contact, providing the guidance and forward-looking planning of a CFO without the full-time cost:</w:t>
       </w:r>
     </w:p>
     <w:p>
@@ -1191,15 +1152,21 @@
         <w:pStyle w:val="CLALTRNormal"/>
         <w:numPr>
           <w:ilvl w:val="0"/>
-          <w:numId w:val="10"/>
+          <w:numId w:val="9"/>
         </w:numPr>
         <w:jc w:val="both"/>
       </w:pPr>
       <w:r>
+        <w:t xml:space="preserve">Serve as the relationship lead (</w:t>
+      </w:r>
+      <w:r>
         <w:rPr>
           <w:highlight w:val="yellow"/>
         </w:rPr>
-        <w:t xml:space="preserve">Turn each entity’s monthly, quarterly, and annual results into clear management reporting and analysis for the physicians and shareholders</w:t>
+        <w:t xml:space="preserve">[Name]</w:t>
+      </w:r>
+      <w:r>
+        <w:t xml:space="preserve">) and the primary finance contact for the physicians, shareholders, and executive board.</w:t>
       </w:r>
     </w:p>
     <w:p>
@@ -1207,15 +1174,12 @@
         <w:pStyle w:val="CLALTRNormal"/>
         <w:numPr>
           <w:ilvl w:val="0"/>
-          <w:numId w:val="10"/>
+          <w:numId w:val="9"/>
         </w:numPr>
         <w:jc w:val="both"/>
       </w:pPr>
       <w:r>
-        <w:rPr>
-          <w:highlight w:val="yellow"/>
-        </w:rPr>
-        <w:t xml:space="preserve">Support the physician compensation process, including class-based allocations and the mid-month physician bonus calculations</w:t>
+        <w:t xml:space="preserve">Present financial results and insight to the executive board as needed and at the annual December shareholder meeting.</w:t>
       </w:r>
     </w:p>
     <w:p>
@@ -1223,15 +1187,12 @@
         <w:pStyle w:val="CLALTRNormal"/>
         <w:numPr>
           <w:ilvl w:val="0"/>
-          <w:numId w:val="10"/>
+          <w:numId w:val="9"/>
         </w:numPr>
         <w:jc w:val="both"/>
       </w:pPr>
       <w:r>
-        <w:rPr>
-          <w:highlight w:val="yellow"/>
-        </w:rPr>
-        <w:t xml:space="preserve">Reconcile revenue-cycle activity to the general ledger and prepare monthly revenue-cycle analysis — gross charges, collection rates, denials, and payer trends — working with the revenue-cycle team to address issues as they arise</w:t>
+        <w:t xml:space="preserve">Lead budgeting, forecasting, and variance analysis to support strategic decisions across the clinics, therapy suites, and surgery center.</w:t>
       </w:r>
     </w:p>
     <w:p>
@@ -1239,15 +1200,12 @@
         <w:pStyle w:val="CLALTRNormal"/>
         <w:numPr>
           <w:ilvl w:val="0"/>
-          <w:numId w:val="10"/>
+          <w:numId w:val="9"/>
         </w:numPr>
         <w:jc w:val="both"/>
       </w:pPr>
       <w:r>
-        <w:rPr>
-          <w:highlight w:val="yellow"/>
-        </w:rPr>
-        <w:t xml:space="preserve">Guide and support the internal accounting team across accounts payable, accounts receivable, and the general ledger, and serve as the day-to-day point of contact for accounting questions</w:t>
+        <w:t xml:space="preserve">Support lender relationships, including borrowing-base and covenant reporting for the Client’s lines of credit.</w:t>
       </w:r>
     </w:p>
     <w:p>
@@ -1255,15 +1213,12 @@
         <w:pStyle w:val="CLALTRNormal"/>
         <w:numPr>
           <w:ilvl w:val="0"/>
-          <w:numId w:val="10"/>
+          <w:numId w:val="9"/>
         </w:numPr>
         <w:jc w:val="both"/>
       </w:pPr>
       <w:r>
-        <w:rPr>
-          <w:highlight w:val="yellow"/>
-        </w:rPr>
-        <w:t xml:space="preserve">Recommend improvements to internal controls, and document accounting processes and procedures</w:t>
+        <w:t xml:space="preserve">Coordinate with the Client’s tax, legal, insurance, benefits, and retirement-plan advisors on finance matters.</w:t>
       </w:r>
     </w:p>
     <w:p>
@@ -1271,15 +1226,34 @@
         <w:pStyle w:val="CLALTRNormal"/>
         <w:numPr>
           <w:ilvl w:val="0"/>
-          <w:numId w:val="10"/>
+          <w:numId w:val="9"/>
         </w:numPr>
         <w:jc w:val="both"/>
       </w:pPr>
       <w:r>
-        <w:rPr>
-          <w:highlight w:val="yellow"/>
-        </w:rPr>
-        <w:t xml:space="preserve">Support audits, regulatory reviews, and information requests, and gather what the Client’s tax preparer needs for the annual returns</w:t>
+        <w:t xml:space="preserve">Advise on financial reporting structure, management reporting, and accounting policy.</w:t>
+      </w:r>
+    </w:p>
+    <w:p>
+      <w:pPr>
+        <w:pStyle w:val="CLALTRNormal"/>
+        <w:jc w:val="both"/>
+      </w:pPr>
+      <w:r>
+        <w:rPr>
+          <w:b/>
+          <w:bCs/>
+        </w:rPr>
+        <w:t xml:space="preserve">Staff-level support</w:t>
+      </w:r>
+    </w:p>
+    <w:p>
+      <w:pPr>
+        <w:pStyle w:val="CLALTRNormal"/>
+        <w:jc w:val="both"/>
+      </w:pPr>
+      <w:r>
+        <w:t xml:space="preserve">Where it helps, ONYX staff accountants add capacity to the internal team, under controller review:</w:t>
       </w:r>
     </w:p>
     <w:p>
@@ -1287,27 +1261,12 @@
         <w:pStyle w:val="CLALTRNormal"/>
         <w:numPr>
           <w:ilvl w:val="0"/>
-          <w:numId w:val="8"/>
+          <w:numId w:val="9"/>
         </w:numPr>
         <w:jc w:val="both"/>
       </w:pPr>
       <w:r>
-        <w:rPr>
-          <w:highlight w:val="yellow"/>
-        </w:rPr>
-        <w:t xml:space="preserve">Systems, automation, and process improvement</w:t>
-      </w:r>
-    </w:p>
-    <w:p>
-      <w:pPr>
-        <w:pStyle w:val="CLALTRNormal"/>
-        <w:jc w:val="both"/>
-      </w:pPr>
-      <w:r>
-        <w:rPr>
-          <w:highlight w:val="yellow"/>
-        </w:rPr>
-        <w:t xml:space="preserve">Practical improvements that reduce manual work without giving up control:</w:t>
+        <w:t xml:space="preserve">Prepare account reconciliations, journal entries, and month-end schedules.</w:t>
       </w:r>
     </w:p>
     <w:p>
@@ -1315,15 +1274,12 @@
         <w:pStyle w:val="CLALTRNormal"/>
         <w:numPr>
           <w:ilvl w:val="0"/>
-          <w:numId w:val="10"/>
+          <w:numId w:val="9"/>
         </w:numPr>
         <w:jc w:val="both"/>
       </w:pPr>
       <w:r>
-        <w:rPr>
-          <w:highlight w:val="yellow"/>
-        </w:rPr>
-        <w:t xml:space="preserve">Map the close and its dependencies, and streamline the manual eClinicalWorks-to-QuickBooks, payroll-to-general-ledger, and allocation processes</w:t>
+        <w:t xml:space="preserve">Support accounts payable processing and payroll journal entries.</w:t>
       </w:r>
     </w:p>
     <w:p>
@@ -1331,15 +1287,34 @@
         <w:pStyle w:val="CLALTRNormal"/>
         <w:numPr>
           <w:ilvl w:val="0"/>
-          <w:numId w:val="10"/>
+          <w:numId w:val="9"/>
         </w:numPr>
         <w:jc w:val="both"/>
       </w:pPr>
       <w:r>
-        <w:rPr>
-          <w:highlight w:val="yellow"/>
-        </w:rPr>
-        <w:t xml:space="preserve">Build an automation roadmap for accounts payable, payroll journals, EMR-to-general-ledger activity, close checklists, and KPI dashboards — with documented review controls, so every automated or AI-assisted output is verified by an experienced team member before it is relied on</w:t>
+        <w:t xml:space="preserve">Cover backlogs, peak periods, and staffing gaps.</w:t>
+      </w:r>
+    </w:p>
+    <w:p>
+      <w:pPr>
+        <w:pStyle w:val="CLALTRNormal"/>
+        <w:jc w:val="both"/>
+      </w:pPr>
+      <w:r>
+        <w:rPr>
+          <w:b/>
+          <w:bCs/>
+        </w:rPr>
+        <w:t xml:space="preserve">Ways to structure the engagement</w:t>
+      </w:r>
+    </w:p>
+    <w:p>
+      <w:pPr>
+        <w:pStyle w:val="CLALTRNormal"/>
+        <w:jc w:val="both"/>
+      </w:pPr>
+      <w:r>
+        <w:t xml:space="preserve">ONYX does not require an all-or-nothing engagement. The Client may engage ONYX in any of the following ways and move between them as its needs change:</w:t>
       </w:r>
     </w:p>
     <w:p>
@@ -1347,15 +1322,12 @@
         <w:pStyle w:val="CLALTRNormal"/>
         <w:numPr>
           <w:ilvl w:val="0"/>
-          <w:numId w:val="10"/>
+          <w:numId w:val="9"/>
         </w:numPr>
         <w:jc w:val="both"/>
       </w:pPr>
       <w:r>
-        <w:rPr>
-          <w:highlight w:val="yellow"/>
-        </w:rPr>
-        <w:t xml:space="preserve">Support the evaluation of a payroll-provider transition and its accounting impacts</w:t>
+        <w:t xml:space="preserve">CFO plus controller support: a CFO-level relationship lead and an ONYX controller who leads the close and the internal team.</w:t>
       </w:r>
     </w:p>
     <w:p>
@@ -1363,27 +1335,12 @@
         <w:pStyle w:val="CLALTRNormal"/>
         <w:numPr>
           <w:ilvl w:val="0"/>
-          <w:numId w:val="8"/>
+          <w:numId w:val="9"/>
         </w:numPr>
         <w:jc w:val="both"/>
       </w:pPr>
       <w:r>
-        <w:rPr>
-          <w:highlight w:val="yellow"/>
-        </w:rPr>
-        <w:t xml:space="preserve">Staff-level support</w:t>
-      </w:r>
-    </w:p>
-    <w:p>
-      <w:pPr>
-        <w:pStyle w:val="CLALTRNormal"/>
-        <w:jc w:val="both"/>
-      </w:pPr>
-      <w:r>
-        <w:rPr>
-          <w:highlight w:val="yellow"/>
-        </w:rPr>
-        <w:t xml:space="preserve">Where it helps, ONYX staff accountants add capacity to the internal team for recurring work, under controller review:</w:t>
+        <w:t xml:space="preserve">Controller-led support with CFO oversight: an ONYX controller leads the day-to-day finance function, with CFO-level oversight and review as requested.</w:t>
       </w:r>
     </w:p>
     <w:p>
@@ -1391,162 +1348,54 @@
         <w:pStyle w:val="CLALTRNormal"/>
         <w:numPr>
           <w:ilvl w:val="0"/>
-          <w:numId w:val="10"/>
+          <w:numId w:val="9"/>
         </w:numPr>
         <w:jc w:val="both"/>
       </w:pPr>
       <w:r>
+        <w:t xml:space="preserve">Targeted staff augmentation: ONYX staff add capacity to the internal team under controller review. CFO oversight can also be paired with an internally hired controller.</w:t>
+      </w:r>
+    </w:p>
+    <w:p>
+      <w:pPr>
+        <w:pStyle w:val="CLALTRNormal"/>
+        <w:jc w:val="both"/>
+      </w:pPr>
+      <w:r>
+        <w:t xml:space="preserve">Initial structure selected: </w:t>
+      </w:r>
+      <w:r>
         <w:rPr>
           <w:highlight w:val="yellow"/>
         </w:rPr>
-        <w:t xml:space="preserve">Prepare account reconciliations, journal entries, and month-end schedules</w:t>
-      </w:r>
-    </w:p>
-    <w:p>
-      <w:pPr>
-        <w:pStyle w:val="CLALTRNormal"/>
-        <w:numPr>
-          <w:ilvl w:val="0"/>
-          <w:numId w:val="10"/>
-        </w:numPr>
-        <w:jc w:val="both"/>
-      </w:pPr>
-      <w:r>
+        <w:t xml:space="preserve">[CFO plus controller / controller-led with CFO oversight / staff augmentation]</w:t>
+      </w:r>
+    </w:p>
+    <w:p>
+      <w:pPr>
+        <w:pStyle w:val="CLALTRHeading2"/>
+        <w:jc w:val="both"/>
+      </w:pPr>
+      <w:r>
+        <w:t xml:space="preserve">Adjusting your services as your needs change</w:t>
+      </w:r>
+    </w:p>
+    <w:p>
+      <w:pPr>
+        <w:pStyle w:val="CLALTRNormal"/>
+        <w:jc w:val="both"/>
+      </w:pPr>
+      <w:r>
+        <w:t xml:space="preserve">Your needs will evolve as your practice grows, and this engagement is built to flex with them. Services can be added, reduced, or adjusted at any time by mutual written agreement, including by email, with no formal addendum or new engagement letter required. All other terms of this agreement remain in effect.</w:t>
+      </w:r>
+    </w:p>
+    <w:p>
+      <w:pPr>
+        <w:pStyle w:val="CLALTRHeading1"/>
+        <w:jc w:val="both"/>
         <w:rPr>
           <w:highlight w:val="yellow"/>
         </w:rPr>
-        <w:t xml:space="preserve">Support accounts payable processing and payroll journal entries</w:t>
-      </w:r>
-    </w:p>
-    <w:p>
-      <w:pPr>
-        <w:pStyle w:val="CLALTRNormal"/>
-        <w:numPr>
-          <w:ilvl w:val="0"/>
-          <w:numId w:val="10"/>
-        </w:numPr>
-        <w:jc w:val="both"/>
-      </w:pPr>
-      <w:r>
-        <w:rPr>
-          <w:highlight w:val="yellow"/>
-        </w:rPr>
-        <w:t xml:space="preserve">Cover backlogs, peak periods, and staffing gaps</w:t>
-      </w:r>
-    </w:p>
-    <w:p>
-      <w:pPr>
-        <w:pStyle w:val="CLALTRNormal"/>
-        <w:numPr>
-          <w:ilvl w:val="0"/>
-          <w:numId w:val="8"/>
-        </w:numPr>
-        <w:jc w:val="both"/>
-      </w:pPr>
-      <w:r>
-        <w:rPr>
-          <w:highlight w:val="yellow"/>
-        </w:rPr>
-        <w:t xml:space="preserve">Flexible ways to structure the engagement</w:t>
-      </w:r>
-    </w:p>
-    <w:p>
-      <w:pPr>
-        <w:pStyle w:val="CLALTRNormal"/>
-        <w:jc w:val="both"/>
-      </w:pPr>
-      <w:r>
-        <w:rPr>
-          <w:highlight w:val="yellow"/>
-        </w:rPr>
-        <w:t xml:space="preserve">ONYX does not require an all-or-nothing engagement. The Client may engage ONYX in any of the following ways and move between them as its needs change:</w:t>
-      </w:r>
-    </w:p>
-    <w:p>
-      <w:pPr>
-        <w:pStyle w:val="CLALTRNormal"/>
-        <w:numPr>
-          <w:ilvl w:val="0"/>
-          <w:numId w:val="10"/>
-        </w:numPr>
-        <w:jc w:val="both"/>
-      </w:pPr>
-      <w:r>
-        <w:rPr>
-          <w:highlight w:val="yellow"/>
-        </w:rPr>
-        <w:t xml:space="preserve">CFO plus controller support — full finance leadership: a CFO-level relationship lead and a controller who leads the close and the internal team</w:t>
-      </w:r>
-    </w:p>
-    <w:p>
-      <w:pPr>
-        <w:pStyle w:val="CLALTRNormal"/>
-        <w:numPr>
-          <w:ilvl w:val="0"/>
-          <w:numId w:val="10"/>
-        </w:numPr>
-        <w:jc w:val="both"/>
-      </w:pPr>
-      <w:r>
-        <w:rPr>
-          <w:highlight w:val="yellow"/>
-        </w:rPr>
-        <w:t xml:space="preserve">Controller-led support with CFO oversight — an ONYX controller leads the day-to-day finance function, with CFO-level oversight and review as requested</w:t>
-      </w:r>
-    </w:p>
-    <w:p>
-      <w:pPr>
-        <w:pStyle w:val="CLALTRNormal"/>
-        <w:numPr>
-          <w:ilvl w:val="0"/>
-          <w:numId w:val="10"/>
-        </w:numPr>
-        <w:jc w:val="both"/>
-      </w:pPr>
-      <w:r>
-        <w:rPr>
-          <w:highlight w:val="yellow"/>
-        </w:rPr>
-        <w:t xml:space="preserve">Targeted staff augmentation — ONYX staff add capacity to the internal team, with controller review; CFO oversight can also be paired with an internally hired controller</w:t>
-      </w:r>
-    </w:p>
-    <w:p>
-      <w:pPr>
-        <w:pStyle w:val="CLALTRNormal"/>
-        <w:jc w:val="both"/>
-      </w:pPr>
-      <w:r>
-        <w:rPr>
-          <w:highlight w:val="yellow"/>
-        </w:rPr>
-        <w:t xml:space="preserve">Initial structure selected: [CFO plus controller / controller-led with CFO oversight / staff augmentation]</w:t>
-      </w:r>
-    </w:p>
-    <w:p>
-      <w:pPr>
-        <w:pStyle w:val="CLALTRHeading2"/>
-        <w:jc w:val="both"/>
-      </w:pPr>
-      <w:r>
-        <w:t xml:space="preserve">Adjusting your services as your needs change</w:t>
-      </w:r>
-    </w:p>
-    <w:p>
-      <w:pPr>
-        <w:pStyle w:val="CLALTRNormal"/>
-        <w:jc w:val="both"/>
-      </w:pPr>
-      <w:r>
-        <w:t xml:space="preserve">Your needs will evolve as your practice grows, and this engagement is built to flex with them. Services can be added, reduced, or adjusted at any time by mutual written agreement — including by email, with no formal addendum or new engagement letter required. All other terms of this agreement remain in effect, so adding or removing a service never requires starting over.</w:t>
-      </w:r>
-    </w:p>
-    <w:p>
-      <w:pPr>
-        <w:pStyle w:val="CLALTRHeading1"/>
-        <w:jc w:val="both"/>
-        <w:rPr>
-          <w:highlight w:val="yellow"/>
-        </w:rPr>
       </w:pPr>
       <w:r>
         <w:t xml:space="preserve">How we’ll work together</w:t>
@@ -1558,10 +1407,7 @@
         <w:jc w:val="both"/>
       </w:pPr>
       <w:r>
-        <w:rPr>
-          <w:highlight w:val="yellow"/>
-        </w:rPr>
-        <w:t xml:space="preserve">Strong financial controls depend on a clear separation of duties. ONYX leads, prepares, and reviews the accounting work, but it does not have signing authority or access to move the Client’s funds; the Client’s internal team continues to process payments and payroll. The Client is responsible for the following:</w:t>
+        <w:t xml:space="preserve">Because ONYX works from the access and records the Client provides and does not have authority to move funds, a few responsibilities stay with the Client. The Client’s internal team continues to process payments and payroll. All approvals should be documented in writing, whether electronically or manually:</w:t>
       </w:r>
     </w:p>
     <w:p>
@@ -1572,15 +1418,9 @@
           <w:numId w:val="21"/>
         </w:numPr>
         <w:jc w:val="both"/>
-        <w:rPr>
-          <w:highlight w:val="yellow"/>
-        </w:rPr>
-      </w:pPr>
-      <w:r>
-        <w:rPr>
-          <w:highlight w:val="yellow"/>
-        </w:rPr>
-        <w:t xml:space="preserve">Provide ONYX with access to QuickBooks Online for each entity, eClinicalWorks reporting, the payroll system, view-only bank access, and the other systems ONYX reasonably needs.</w:t>
+      </w:pPr>
+      <w:r>
+        <w:t xml:space="preserve">Provide ONYX with access to QuickBooks Online for each entity, eClinicalWorks reporting, the payroll system, and view access to bank and loan accounts, plus the reports and records needed to do the work.</w:t>
       </w:r>
     </w:p>
     <w:p>
@@ -1591,15 +1431,9 @@
           <w:numId w:val="21"/>
         </w:numPr>
         <w:jc w:val="both"/>
-        <w:rPr>
-          <w:highlight w:val="yellow"/>
-        </w:rPr>
-      </w:pPr>
-      <w:r>
-        <w:rPr>
-          <w:highlight w:val="yellow"/>
-        </w:rPr>
-        <w:t xml:space="preserve">Provide timely, accurate information, designate a point of contact for day-to-day questions, and make Mark Williamson available for onboarding and knowledge transfer.</w:t>
+      </w:pPr>
+      <w:r>
+        <w:t xml:space="preserve">Provide timely, accurate information and a primary point of contact, and make Mark Williamson and the internal accounting staff available to support onboarding and the ongoing work.</w:t>
       </w:r>
     </w:p>
     <w:p>
@@ -1610,15 +1444,9 @@
           <w:numId w:val="21"/>
         </w:numPr>
         <w:jc w:val="both"/>
-        <w:rPr>
-          <w:highlight w:val="yellow"/>
-        </w:rPr>
-      </w:pPr>
-      <w:r>
-        <w:rPr>
-          <w:highlight w:val="yellow"/>
-        </w:rPr>
-        <w:t xml:space="preserve">Keep approval authority over the Client’s own transactions — including invoices and payments, wire transfers, new vendors, payroll and employee changes, and physician compensation and bonus payments — with all approvals documented in writing, electronically or manually.</w:t>
+      </w:pPr>
+      <w:r>
+        <w:t xml:space="preserve">Retain approval authority over the Client’s own transactions, including invoices and payments, wire transfers, new vendors, payroll and employee changes, and physician compensation and bonus payments.</w:t>
       </w:r>
     </w:p>
     <w:p>
@@ -1629,15 +1457,9 @@
           <w:numId w:val="21"/>
         </w:numPr>
         <w:jc w:val="both"/>
-        <w:rPr>
-          <w:highlight w:val="yellow"/>
-        </w:rPr>
-      </w:pPr>
-      <w:r>
-        <w:rPr>
-          <w:highlight w:val="yellow"/>
-        </w:rPr>
-        <w:t xml:space="preserve">Review and approve the bank statements and monthly bank reconciliations.</w:t>
+      </w:pPr>
+      <w:r>
+        <w:t xml:space="preserve">Review and approve the bank statements and monthly bank and loan reconciliations.</w:t>
       </w:r>
     </w:p>
     <w:p>
@@ -1648,15 +1470,9 @@
           <w:numId w:val="21"/>
         </w:numPr>
         <w:jc w:val="both"/>
-        <w:rPr>
-          <w:highlight w:val="yellow"/>
-        </w:rPr>
-      </w:pPr>
-      <w:r>
-        <w:rPr>
-          <w:highlight w:val="yellow"/>
-        </w:rPr>
-        <w:t xml:space="preserve">Retain responsibility for patient billing and coding and for compliance with healthcare and payer regulations.</w:t>
+      </w:pPr>
+      <w:r>
+        <w:t xml:space="preserve">Maintain responsibility for tax filings, patient billing and coding, and compliance with the Client’s healthcare, payer, lender, and benefit-plan obligations.</w:t>
       </w:r>
     </w:p>
     <w:p>
@@ -2011,33 +1827,7 @@
           <w:b w:val="0"/>
           <w:u w:val="single"/>
         </w:rPr>
-        <w:t xml:space="preserve">Onboarding and knowledge transfer (anticipated to last approximately </w:t>
-      </w:r>
-      <w:r>
-        <w:rPr>
-          <w:b w:val="0"/>
-          <w:highlight w:val="yellow"/>
-          <w:u w:val="single"/>
-        </w:rPr>
-        <w:t>90</w:t>
-      </w:r>
-      <w:r>
-        <w:rPr>
-          <w:b w:val="0"/>
-          <w:u w:val="single"/>
-        </w:rPr>
-        <w:t xml:space="preserve"> days):</w:t>
-      </w:r>
-      <w:r>
-        <w:t xml:space="preserve"> </w:t>
-      </w:r>
-      <w:r>
-        <w:rPr>
-          <w:rStyle w:val="CLALTRHiddenTextChar"/>
-          <w:b/>
-          <w:i/>
-        </w:rPr>
-        <w:t/>
+        <w:t xml:space="preserve">Onboarding and knowledge transfer (first 90 days):</w:t>
       </w:r>
     </w:p>
     <w:p>
@@ -2050,257 +1840,20 @@
         <w:jc w:val="both"/>
       </w:pPr>
       <w:r>
-        <w:rPr>
-          <w:highlight w:val="yellow"/>
-        </w:rPr>
-        <w:t>Services performed by Staff Accountant</w:t>
-      </w:r>
-      <w:r>
-        <w:rPr>
-          <w:highlight w:val="yellow"/>
-        </w:rPr>
-        <w:tab/>
-      </w:r>
-      <w:r>
-        <w:rPr>
-          <w:highlight w:val="yellow"/>
-        </w:rPr>
-        <w:tab/>
-      </w:r>
-      <w:r>
-        <w:rPr>
-          <w:highlight w:val="yellow"/>
-        </w:rPr>
-        <w:tab/>
-      </w:r>
-      <w:r>
-        <w:rPr>
-          <w:highlight w:val="yellow"/>
-        </w:rPr>
-        <w:tab/>
-      </w:r>
-      <w:r>
-        <w:rPr>
-          <w:highlight w:val="yellow"/>
-        </w:rPr>
-        <w:tab/>
-      </w:r>
-      <w:r>
-        <w:rPr>
-          <w:highlight w:val="yellow"/>
-        </w:rPr>
-        <w:tab/>
-      </w:r>
-      <w:r>
-        <w:fldChar w:fldCharType="begin">
-          <w:ffData>
-            <w:name w:val="Text49"/>
-            <w:enabled/>
-            <w:calcOnExit w:val="0"/>
-            <w:textInput>
-              <w:default w:val="[hours]"/>
-            </w:textInput>
-          </w:ffData>
-        </w:fldChar>
-      </w:r>
-      <w:r>
-        <w:instrText xml:space="preserve"> FORMTEXT </w:instrText>
-      </w:r>
-      <w:r>
-        <w:fldChar w:fldCharType="separate"/>
-      </w:r>
-      <w:r>
-        <w:rPr>
-          <w:noProof/>
-        </w:rPr>
-        <w:t>[hours]</w:t>
-      </w:r>
-      <w:r>
-        <w:fldChar w:fldCharType="end"/>
-      </w:r>
-      <w:r>
-        <w:rPr>
-          <w:highlight w:val="yellow"/>
-        </w:rPr>
-        <w:t xml:space="preserve"> hours per week</w:t>
-      </w:r>
-    </w:p>
-    <w:p>
-      <w:pPr>
-        <w:pStyle w:val="CLALTRNormal"/>
-        <w:numPr>
-          <w:ilvl w:val="0"/>
-          <w:numId w:val="14"/>
-        </w:numPr>
-        <w:jc w:val="both"/>
-      </w:pPr>
-      <w:r>
-        <w:rPr>
-          <w:highlight w:val="yellow"/>
-        </w:rPr>
-        <w:t>Services performed by Controller</w:t>
-      </w:r>
-      <w:r>
-        <w:rPr>
-          <w:highlight w:val="yellow"/>
-        </w:rPr>
-        <w:tab/>
-      </w:r>
-      <w:r>
-        <w:rPr>
-          <w:highlight w:val="yellow"/>
-        </w:rPr>
-        <w:tab/>
-      </w:r>
-      <w:r>
-        <w:rPr>
-          <w:highlight w:val="yellow"/>
-        </w:rPr>
-        <w:tab/>
-      </w:r>
-      <w:r>
-        <w:rPr>
-          <w:highlight w:val="yellow"/>
-        </w:rPr>
-        <w:tab/>
-      </w:r>
-      <w:r>
-        <w:rPr>
-          <w:highlight w:val="yellow"/>
-        </w:rPr>
-        <w:tab/>
-      </w:r>
-      <w:r>
-        <w:fldChar w:fldCharType="begin">
-          <w:ffData>
-            <w:name w:val="Text49"/>
-            <w:enabled/>
-            <w:calcOnExit w:val="0"/>
-            <w:textInput>
-              <w:default w:val="[hours]"/>
-            </w:textInput>
-          </w:ffData>
-        </w:fldChar>
-      </w:r>
-      <w:r>
-        <w:instrText xml:space="preserve"> FORMTEXT </w:instrText>
-      </w:r>
-      <w:r>
-        <w:fldChar w:fldCharType="separate"/>
-      </w:r>
-      <w:r>
-        <w:rPr>
-          <w:noProof/>
-        </w:rPr>
-        <w:t>[hours]</w:t>
-      </w:r>
-      <w:r>
-        <w:fldChar w:fldCharType="end"/>
-      </w:r>
-      <w:r>
-        <w:rPr>
-          <w:highlight w:val="yellow"/>
-        </w:rPr>
-        <w:t xml:space="preserve"> hours per week</w:t>
-      </w:r>
-    </w:p>
-    <w:p>
-      <w:pPr>
-        <w:pStyle w:val="CLALTRNormal"/>
-        <w:numPr>
-          <w:ilvl w:val="0"/>
-          <w:numId w:val="14"/>
-        </w:numPr>
-        <w:jc w:val="both"/>
-      </w:pPr>
-      <w:r>
-        <w:rPr>
-          <w:highlight w:val="yellow"/>
-        </w:rPr>
-        <w:t xml:space="preserve">Services performed by </w:t>
-      </w:r>
-      <w:r>
-        <w:fldChar w:fldCharType="begin">
-          <w:ffData>
-            <w:name w:val=""/>
-            <w:enabled/>
-            <w:calcOnExit w:val="0"/>
-            <w:textInput>
-              <w:default w:val="CFO"/>
-            </w:textInput>
-          </w:ffData>
-        </w:fldChar>
-      </w:r>
-      <w:r>
-        <w:instrText xml:space="preserve"> FORMTEXT </w:instrText>
-      </w:r>
-      <w:r>
-        <w:fldChar w:fldCharType="separate"/>
-      </w:r>
-      <w:r>
-        <w:rPr>
-          <w:noProof/>
-        </w:rPr>
-        <w:t>CFO</w:t>
-      </w:r>
-      <w:r>
-        <w:fldChar w:fldCharType="end"/>
-      </w:r>
-      <w:r>
-        <w:rPr>
-          <w:highlight w:val="yellow"/>
-        </w:rPr>
-        <w:t/>
-      </w:r>
-      <w:r>
-        <w:rPr>
-          <w:highlight w:val="yellow"/>
-        </w:rPr>
-        <w:tab/>
-      </w:r>
-      <w:r>
-        <w:rPr>
-          <w:highlight w:val="yellow"/>
-        </w:rPr>
-        <w:tab/>
-      </w:r>
-      <w:r>
-        <w:rPr>
-          <w:highlight w:val="yellow"/>
-        </w:rPr>
-        <w:t xml:space="preserve">     </w:t>
-      </w:r>
-      <w:r>
-        <w:rPr>
-          <w:highlight w:val="yellow"/>
-        </w:rPr>
-        <w:t>as requested or required</w:t>
+        <w:t xml:space="preserve">Billed hourly as incurred. ONYX will provide weekly progress-and-budget updates so there are no surprises.</w:t>
       </w:r>
     </w:p>
     <w:p>
       <w:pPr>
         <w:pStyle w:val="CLALTRHeading2"/>
         <w:jc w:val="both"/>
+      </w:pPr>
+      <w:r>
         <w:rPr>
           <w:b w:val="0"/>
           <w:u w:val="single"/>
         </w:rPr>
-      </w:pPr>
-      <w:proofErr w:type="gramStart"/>
-      <w:r>
-        <w:rPr>
-          <w:b w:val="0"/>
-          <w:u w:val="single"/>
-        </w:rPr>
-        <w:t>Ongoing</w:t>
-      </w:r>
-      <w:proofErr w:type="gramEnd"/>
-      <w:r>
-        <w:rPr>
-          <w:b w:val="0"/>
-          <w:u w:val="single"/>
-        </w:rPr>
-        <w:t xml:space="preserve"> normal accounting services:</w:t>
+        <w:t xml:space="preserve">Ongoing controller and CFO services:</w:t>
       </w:r>
     </w:p>
     <w:p>
@@ -2313,255 +1866,7 @@
         <w:jc w:val="both"/>
       </w:pPr>
       <w:r>
-        <w:rPr>
-          <w:highlight w:val="yellow"/>
-        </w:rPr>
-        <w:t>Services performed by Staff Accountant</w:t>
-      </w:r>
-      <w:r>
-        <w:rPr>
-          <w:highlight w:val="yellow"/>
-        </w:rPr>
-        <w:tab/>
-      </w:r>
-      <w:r>
-        <w:rPr>
-          <w:highlight w:val="yellow"/>
-        </w:rPr>
-        <w:tab/>
-      </w:r>
-      <w:r>
-        <w:rPr>
-          <w:highlight w:val="yellow"/>
-        </w:rPr>
-        <w:tab/>
-      </w:r>
-      <w:r>
-        <w:rPr>
-          <w:highlight w:val="yellow"/>
-        </w:rPr>
-        <w:tab/>
-      </w:r>
-      <w:proofErr w:type="gramStart"/>
-      <w:r>
-        <w:rPr>
-          <w:highlight w:val="yellow"/>
-        </w:rPr>
-        <w:tab/>
-        <w:t xml:space="preserve">  </w:t>
-      </w:r>
-      <w:r>
-        <w:rPr>
-          <w:highlight w:val="yellow"/>
-        </w:rPr>
-        <w:t>Estimated</w:t>
-      </w:r>
-      <w:proofErr w:type="gramEnd"/>
-      <w:r>
-        <w:rPr>
-          <w:highlight w:val="yellow"/>
-        </w:rPr>
-        <w:t xml:space="preserve"> </w:t>
-      </w:r>
-      <w:bookmarkStart w:id="7" w:name="Text49"/>
-      <w:r>
-        <w:fldChar w:fldCharType="begin">
-          <w:ffData>
-            <w:name w:val="Text49"/>
-            <w:enabled/>
-            <w:calcOnExit w:val="0"/>
-            <w:textInput>
-              <w:default w:val="[hours]"/>
-            </w:textInput>
-          </w:ffData>
-        </w:fldChar>
-      </w:r>
-      <w:r>
-        <w:instrText xml:space="preserve"> FORMTEXT </w:instrText>
-      </w:r>
-      <w:r>
-        <w:fldChar w:fldCharType="separate"/>
-      </w:r>
-      <w:r>
-        <w:rPr>
-          <w:noProof/>
-        </w:rPr>
-        <w:t>[hours]</w:t>
-      </w:r>
-      <w:r>
-        <w:fldChar w:fldCharType="end"/>
-      </w:r>
-      <w:bookmarkEnd w:id="7"/>
-      <w:r>
-        <w:rPr>
-          <w:highlight w:val="yellow"/>
-        </w:rPr>
-        <w:t xml:space="preserve"> hours per week</w:t>
-      </w:r>
-    </w:p>
-    <w:p>
-      <w:pPr>
-        <w:pStyle w:val="CLALTRNormal"/>
-        <w:numPr>
-          <w:ilvl w:val="0"/>
-          <w:numId w:val="15"/>
-        </w:numPr>
-        <w:jc w:val="both"/>
-      </w:pPr>
-      <w:r>
-        <w:rPr>
-          <w:highlight w:val="yellow"/>
-        </w:rPr>
-        <w:t>Services performed</w:t>
-      </w:r>
-      <w:r>
-        <w:rPr>
-          <w:highlight w:val="yellow"/>
-        </w:rPr>
-        <w:t xml:space="preserve"> by Controller</w:t>
-      </w:r>
-      <w:r>
-        <w:rPr>
-          <w:highlight w:val="yellow"/>
-        </w:rPr>
-        <w:tab/>
-      </w:r>
-      <w:r>
-        <w:rPr>
-          <w:highlight w:val="yellow"/>
-        </w:rPr>
-        <w:tab/>
-      </w:r>
-      <w:r>
-        <w:rPr>
-          <w:highlight w:val="yellow"/>
-        </w:rPr>
-        <w:tab/>
-      </w:r>
-      <w:r>
-        <w:rPr>
-          <w:highlight w:val="yellow"/>
-        </w:rPr>
-        <w:tab/>
-      </w:r>
-      <w:r>
-        <w:rPr>
-          <w:highlight w:val="yellow"/>
-        </w:rPr>
-        <w:t xml:space="preserve">Estimated </w:t>
-      </w:r>
-      <w:r>
-        <w:fldChar w:fldCharType="begin">
-          <w:ffData>
-            <w:name w:val="Text49"/>
-            <w:enabled/>
-            <w:calcOnExit w:val="0"/>
-            <w:textInput>
-              <w:default w:val="[hours]"/>
-            </w:textInput>
-          </w:ffData>
-        </w:fldChar>
-      </w:r>
-      <w:r>
-        <w:instrText xml:space="preserve"> FORMTEXT </w:instrText>
-      </w:r>
-      <w:r>
-        <w:fldChar w:fldCharType="separate"/>
-      </w:r>
-      <w:r>
-        <w:rPr>
-          <w:noProof/>
-        </w:rPr>
-        <w:t>[hours]</w:t>
-      </w:r>
-      <w:r>
-        <w:fldChar w:fldCharType="end"/>
-      </w:r>
-      <w:r>
-        <w:rPr>
-          <w:highlight w:val="yellow"/>
-        </w:rPr>
-        <w:t xml:space="preserve"> hours per month</w:t>
-      </w:r>
-    </w:p>
-    <w:p>
-      <w:pPr>
-        <w:pStyle w:val="CLALTRNormal"/>
-        <w:numPr>
-          <w:ilvl w:val="0"/>
-          <w:numId w:val="15"/>
-        </w:numPr>
-        <w:jc w:val="both"/>
-      </w:pPr>
-      <w:r>
-        <w:rPr>
-          <w:highlight w:val="yellow"/>
-        </w:rPr>
-        <w:t xml:space="preserve">Services performed by </w:t>
-      </w:r>
-      <w:r>
-        <w:fldChar w:fldCharType="begin">
-          <w:ffData>
-            <w:name w:val=""/>
-            <w:enabled/>
-            <w:calcOnExit w:val="0"/>
-            <w:textInput>
-              <w:default w:val="CFO"/>
-            </w:textInput>
-          </w:ffData>
-        </w:fldChar>
-      </w:r>
-      <w:r>
-        <w:instrText xml:space="preserve"> FORMTEXT </w:instrText>
-      </w:r>
-      <w:r>
-        <w:fldChar w:fldCharType="separate"/>
-      </w:r>
-      <w:r>
-        <w:rPr>
-          <w:noProof/>
-        </w:rPr>
-        <w:t>CFO</w:t>
-      </w:r>
-      <w:r>
-        <w:fldChar w:fldCharType="end"/>
-      </w:r>
-      <w:r>
-        <w:rPr>
-          <w:highlight w:val="yellow"/>
-        </w:rPr>
-        <w:t/>
-      </w:r>
-      <w:r>
-        <w:rPr>
-          <w:highlight w:val="yellow"/>
-        </w:rPr>
-        <w:tab/>
-      </w:r>
-      <w:r>
-        <w:rPr>
-          <w:highlight w:val="yellow"/>
-        </w:rPr>
-        <w:tab/>
-        <w:t xml:space="preserve">     </w:t>
-      </w:r>
-      <w:r>
-        <w:rPr>
-          <w:highlight w:val="yellow"/>
-        </w:rPr>
-        <w:t>as requested or required</w:t>
-      </w:r>
-    </w:p>
-    <w:p>
-      <w:pPr>
-        <w:pStyle w:val="CLALTRNormal"/>
-        <w:jc w:val="both"/>
-      </w:pPr>
-      <w:r>
-        <w:rPr>
-          <w:highlight w:val="yellow"/>
-        </w:rPr>
-        <w:t xml:space="preserve">These estimates depend on the engagement structure the Client selects and will be refined once ONYX reviews the Client’s discovery materials.</w:t>
+        <w:t xml:space="preserve">Billed hourly at the rates above, based on the engagement structure the Client selects and the volume and mix of work.</w:t>
       </w:r>
     </w:p>
     <w:p>
@@ -2852,7 +2157,7 @@
         <w:t xml:space="preserve">the Client </w:t>
       </w:r>
       <w:r>
-        <w:t xml:space="preserve">with the </w:t>
+        <w:t xml:space="preserve">with </w:t>
       </w:r>
       <w:r>
         <w:fldChar w:fldCharType="begin">
@@ -2876,7 +2181,7 @@
         <w:rPr>
           <w:noProof/>
         </w:rPr>
-        <w:t>monthly close and financial reporting</w:t>
+        <w:t>the books and supporting schedules</w:t>
       </w:r>
       <w:r>
         <w:fldChar w:fldCharType="end"/>
@@ -5030,6 +4335,9 @@
         <w:t xml:space="preserve">Title: </w:t>
       </w:r>
       <w:r>
+        <w:rPr>
+          <w:highlight w:val="yellow"/>
+        </w:rPr>
         <w:t xml:space="preserve">[Title]</w:t>
       </w:r>
     </w:p>

</xml_diff>

<commit_message>
Arizona Center for Hand to Shoulder Surgery: proposal deck in the AJAC layout
Replaces the earlier Comisario-style deck with the 14-slide AJAC / George
Brazil proposal format, rebuilt from the Oct 5, 2026 call recap and the
ACHS engagement letter: intro note to Mark, contents, who we are, team
table, understanding of the practice, services, how we work together,
Nov 2026 to Apr 2027 timeline, 30/60/90 plan, deliverables, hourly fees,
why ONYX and next steps. Client logo spots carry a text wordmark until the
practice's logo is supplied.

Letter: names Steven Nikolov as relationship lead and states the onsite
cadence, so the letter matches the deck.

Co-Authored-By: Claude Fable 5.1 <noreply@anthropic.com>
Claude-Session: https://claude.ai/code/session_01KQiKzmv3wJWX8AFkC8re3n
</commit_message>
<xml_diff>
--- a/Onyx_Engagement_Letter_AZHandCenter_HOURLY.docx
+++ b/Onyx_Engagement_Letter_AZHandCenter_HOURLY.docx
@@ -981,10 +981,8 @@
         <w:t xml:space="preserve">Work onsite at the Client’s offices </w:t>
       </w:r>
       <w:r>
-        <w:rPr>
-          <w:highlight w:val="yellow"/>
-        </w:rPr>
-        <w:t xml:space="preserve">[onsite cadence]</w:t>
+        <w:rPr/>
+        <w:t>for kickoff, onboarding and training,</w:t>
       </w:r>
       <w:r>
         <w:t xml:space="preserve"> and remotely otherwise.</w:t>
@@ -1160,10 +1158,8 @@
         <w:t xml:space="preserve">Serve as the relationship lead (</w:t>
       </w:r>
       <w:r>
-        <w:rPr>
-          <w:highlight w:val="yellow"/>
-        </w:rPr>
-        <w:t xml:space="preserve">[Name]</w:t>
+        <w:rPr/>
+        <w:t>Steven Nikolov</w:t>
       </w:r>
       <w:r>
         <w:t xml:space="preserve">) and the primary finance contact for the physicians, shareholders, and executive board.</w:t>

</xml_diff>

<commit_message>
Arizona Center for Hand to Shoulder Surgery: logo, team, titles and retirement wording in the proposal
Deck: practice logo (navy version) on the cover and closing slide; Mark
Williamson shown as CFO and his retirement referenced in the intro note;
engagement team now Steven Nikolov, Lisa Danforth CPA (CFO), Jessica
Bumphus (Controller), then Josephine Mack and staff; Who we are notes the
Intuit Elite Level Partner (QuickBooks Online) status; Josephine's title
uses an ampersand throughout.

Letter: Attn and signature Title lines set to CFO.

proposal-deck skill: builder supports a five-row team table and client
logo files; logo stored under logos/.

Co-Authored-By: Claude Fable 5.1 <noreply@anthropic.com>
Claude-Session: https://claude.ai/code/session_01KQiKzmv3wJWX8AFkC8re3n
</commit_message>
<xml_diff>
--- a/Onyx_Engagement_Letter_AZHandCenter_HOURLY.docx
+++ b/Onyx_Engagement_Letter_AZHandCenter_HOURLY.docx
@@ -449,10 +449,8 @@
         <w:t xml:space="preserve">Attn: Mark Williamson, </w:t>
       </w:r>
       <w:r>
-        <w:rPr>
-          <w:highlight w:val="yellow"/>
-        </w:rPr>
-        <w:t xml:space="preserve">[Title]</w:t>
+        <w:rPr/>
+        <w:t>CFO</w:t>
       </w:r>
     </w:p>
     <w:p>
@@ -4331,10 +4329,8 @@
         <w:t xml:space="preserve">Title: </w:t>
       </w:r>
       <w:r>
-        <w:rPr>
-          <w:highlight w:val="yellow"/>
-        </w:rPr>
-        <w:t xml:space="preserve">[Title]</w:t>
+        <w:rPr/>
+        <w:t>CFO</w:t>
       </w:r>
     </w:p>
     <w:p>

</xml_diff>